<commit_message>
Mise à jour du journal de bord et début d'un fichier illustrant le modèle de Lotka-Volterra.
</commit_message>
<xml_diff>
--- a/Maths/Moteur_RTS_exercices_maths_partie_1.docx
+++ b/Maths/Moteur_RTS_exercices_maths_partie_1.docx
@@ -120,7 +120,21 @@
         <w:rPr>
           <w:rFonts w:ascii="Cambria Math" w:hAnsi="Cambria Math"/>
         </w:rPr>
-        <w:t xml:space="preserve"> et dt = 1.</w:t>
+        <w:t xml:space="preserve"> et </w:t>
+      </w:r>
+      <w:proofErr w:type="spellStart"/>
+      <w:r>
+        <w:rPr>
+          <w:rFonts w:ascii="Cambria Math" w:hAnsi="Cambria Math"/>
+        </w:rPr>
+        <w:t>dt</w:t>
+      </w:r>
+      <w:proofErr w:type="spellEnd"/>
+      <w:r>
+        <w:rPr>
+          <w:rFonts w:ascii="Cambria Math" w:hAnsi="Cambria Math"/>
+        </w:rPr>
+        <w:t xml:space="preserve"> = 1.</w:t>
       </w:r>
     </w:p>
     <w:p>
@@ -237,8 +251,16 @@
         <w:rPr>
           <w:rFonts w:ascii="Cambria Math" w:hAnsi="Cambria Math"/>
         </w:rPr>
-        <w:t xml:space="preserve"> ae</w:t>
-      </w:r>
+        <w:t xml:space="preserve"> </w:t>
+      </w:r>
+      <w:proofErr w:type="spellStart"/>
+      <w:r>
+        <w:rPr>
+          <w:rFonts w:ascii="Cambria Math" w:hAnsi="Cambria Math"/>
+        </w:rPr>
+        <w:t>ae</w:t>
+      </w:r>
+      <w:proofErr w:type="spellEnd"/>
       <w:r>
         <w:rPr>
           <w:rFonts w:ascii="Cambria Math" w:hAnsi="Cambria Math"/>
@@ -297,7 +319,21 @@
         <w:rPr>
           <w:rFonts w:ascii="Cambria Math" w:hAnsi="Cambria Math"/>
         </w:rPr>
-        <w:t>= aP proposée.</w:t>
+        <w:t xml:space="preserve">= </w:t>
+      </w:r>
+      <w:proofErr w:type="spellStart"/>
+      <w:r>
+        <w:rPr>
+          <w:rFonts w:ascii="Cambria Math" w:hAnsi="Cambria Math"/>
+        </w:rPr>
+        <w:t>aP</w:t>
+      </w:r>
+      <w:proofErr w:type="spellEnd"/>
+      <w:r>
+        <w:rPr>
+          <w:rFonts w:ascii="Cambria Math" w:hAnsi="Cambria Math"/>
+        </w:rPr>
+        <w:t xml:space="preserve"> proposée.</w:t>
       </w:r>
     </w:p>
     <w:p>
@@ -450,7 +486,23 @@
           <w:rFonts w:ascii="Cambria Math" w:hAnsi="Cambria Math"/>
           <w:lang w:val="en-US"/>
         </w:rPr>
-        <w:t xml:space="preserve"> K = 2.</w:t>
+        <w:t xml:space="preserve"> </w:t>
+      </w:r>
+      <w:proofErr w:type="spellStart"/>
+      <w:r>
+        <w:rPr>
+          <w:rFonts w:ascii="Cambria Math" w:hAnsi="Cambria Math"/>
+          <w:lang w:val="en-US"/>
+        </w:rPr>
+        <w:t>K</w:t>
+      </w:r>
+      <w:proofErr w:type="spellEnd"/>
+      <w:r>
+        <w:rPr>
+          <w:rFonts w:ascii="Cambria Math" w:hAnsi="Cambria Math"/>
+          <w:lang w:val="en-US"/>
+        </w:rPr>
+        <w:t xml:space="preserve"> = 2.</w:t>
       </w:r>
     </w:p>
     <w:p>
@@ -788,7 +840,43 @@
           <w:sz w:val="32"/>
           <w:szCs w:val="32"/>
         </w:rPr>
-        <w:t>= aP – bP²</w:t>
+        <w:t xml:space="preserve">= </w:t>
+      </w:r>
+      <w:proofErr w:type="spellStart"/>
+      <w:r>
+        <w:rPr>
+          <w:rFonts w:ascii="Cambria Math" w:hAnsi="Cambria Math"/>
+          <w:sz w:val="32"/>
+          <w:szCs w:val="32"/>
+        </w:rPr>
+        <w:t>aP</w:t>
+      </w:r>
+      <w:proofErr w:type="spellEnd"/>
+      <w:r>
+        <w:rPr>
+          <w:rFonts w:ascii="Cambria Math" w:hAnsi="Cambria Math"/>
+          <w:sz w:val="32"/>
+          <w:szCs w:val="32"/>
+        </w:rPr>
+        <w:t xml:space="preserve"> – </w:t>
+      </w:r>
+      <w:proofErr w:type="spellStart"/>
+      <w:r>
+        <w:rPr>
+          <w:rFonts w:ascii="Cambria Math" w:hAnsi="Cambria Math"/>
+          <w:sz w:val="32"/>
+          <w:szCs w:val="32"/>
+        </w:rPr>
+        <w:t>bP</w:t>
+      </w:r>
+      <w:proofErr w:type="spellEnd"/>
+      <w:r>
+        <w:rPr>
+          <w:rFonts w:ascii="Cambria Math" w:hAnsi="Cambria Math"/>
+          <w:sz w:val="32"/>
+          <w:szCs w:val="32"/>
+        </w:rPr>
+        <w:t>²</w:t>
       </w:r>
     </w:p>
     <w:p>
@@ -1099,7 +1187,21 @@
         <w:rPr>
           <w:rFonts w:ascii="Cambria Math" w:hAnsi="Cambria Math"/>
         </w:rPr>
-        <w:t xml:space="preserve">Avec ce qui vient d’être constaté, nous pouvons dire qu’une expression de la population à l’équilibre est : Pe = K = </w:t>
+        <w:t xml:space="preserve">Avec ce qui vient d’être constaté, nous pouvons dire qu’une expression de la population à l’équilibre est : </w:t>
+      </w:r>
+      <w:proofErr w:type="spellStart"/>
+      <w:r>
+        <w:rPr>
+          <w:rFonts w:ascii="Cambria Math" w:hAnsi="Cambria Math"/>
+        </w:rPr>
+        <w:t>Pe</w:t>
+      </w:r>
+      <w:proofErr w:type="spellEnd"/>
+      <w:r>
+        <w:rPr>
+          <w:rFonts w:ascii="Cambria Math" w:hAnsi="Cambria Math"/>
+        </w:rPr>
+        <w:t xml:space="preserve"> = K = </w:t>
       </w:r>
       <m:oMath>
         <m:f>
@@ -1426,7 +1528,21 @@
         <w:rPr>
           <w:rFonts w:ascii="Cambria Math" w:hAnsi="Cambria Math"/>
         </w:rPr>
-        <w:t xml:space="preserve">= aP </w:t>
+        <w:t xml:space="preserve">= </w:t>
+      </w:r>
+      <w:proofErr w:type="spellStart"/>
+      <w:r>
+        <w:rPr>
+          <w:rFonts w:ascii="Cambria Math" w:hAnsi="Cambria Math"/>
+        </w:rPr>
+        <w:t>aP</w:t>
+      </w:r>
+      <w:proofErr w:type="spellEnd"/>
+      <w:r>
+        <w:rPr>
+          <w:rFonts w:ascii="Cambria Math" w:hAnsi="Cambria Math"/>
+        </w:rPr>
+        <w:t xml:space="preserve"> </w:t>
       </w:r>
       <w:r>
         <w:rPr>
@@ -1484,7 +1600,21 @@
         <w:rPr>
           <w:rFonts w:ascii="Cambria Math" w:hAnsi="Cambria Math"/>
         </w:rPr>
-        <w:t xml:space="preserve"> aP = </w:t>
+        <w:t xml:space="preserve"> </w:t>
+      </w:r>
+      <w:proofErr w:type="spellStart"/>
+      <w:r>
+        <w:rPr>
+          <w:rFonts w:ascii="Cambria Math" w:hAnsi="Cambria Math"/>
+        </w:rPr>
+        <w:t>aP</w:t>
+      </w:r>
+      <w:proofErr w:type="spellEnd"/>
+      <w:r>
+        <w:rPr>
+          <w:rFonts w:ascii="Cambria Math" w:hAnsi="Cambria Math"/>
+        </w:rPr>
+        <w:t xml:space="preserve"> = </w:t>
       </w:r>
       <w:r>
         <w:rPr>
@@ -1677,7 +1807,35 @@
         <w:rPr>
           <w:rFonts w:ascii="Cambria Math" w:hAnsi="Cambria Math"/>
         </w:rPr>
-        <w:t xml:space="preserve">= aP – bP² , donc </w:t>
+        <w:t xml:space="preserve">= </w:t>
+      </w:r>
+      <w:proofErr w:type="spellStart"/>
+      <w:r>
+        <w:rPr>
+          <w:rFonts w:ascii="Cambria Math" w:hAnsi="Cambria Math"/>
+        </w:rPr>
+        <w:t>aP</w:t>
+      </w:r>
+      <w:proofErr w:type="spellEnd"/>
+      <w:r>
+        <w:rPr>
+          <w:rFonts w:ascii="Cambria Math" w:hAnsi="Cambria Math"/>
+        </w:rPr>
+        <w:t xml:space="preserve"> – </w:t>
+      </w:r>
+      <w:proofErr w:type="spellStart"/>
+      <w:r>
+        <w:rPr>
+          <w:rFonts w:ascii="Cambria Math" w:hAnsi="Cambria Math"/>
+        </w:rPr>
+        <w:t>bP</w:t>
+      </w:r>
+      <w:proofErr w:type="spellEnd"/>
+      <w:r>
+        <w:rPr>
+          <w:rFonts w:ascii="Cambria Math" w:hAnsi="Cambria Math"/>
+        </w:rPr>
+        <w:t xml:space="preserve">² , donc </w:t>
       </w:r>
       <m:oMath>
         <m:f>
@@ -1729,14 +1887,42 @@
         <w:rPr>
           <w:rFonts w:ascii="Cambria Math" w:hAnsi="Cambria Math"/>
         </w:rPr>
-        <w:t xml:space="preserve"> aP – bP² = 0</w:t>
-      </w:r>
-      <w:r>
-        <w:rPr>
-          <w:rFonts w:ascii="Cambria Math" w:hAnsi="Cambria Math"/>
-        </w:rPr>
         <w:t xml:space="preserve"> </w:t>
       </w:r>
+      <w:proofErr w:type="spellStart"/>
+      <w:r>
+        <w:rPr>
+          <w:rFonts w:ascii="Cambria Math" w:hAnsi="Cambria Math"/>
+        </w:rPr>
+        <w:t>aP</w:t>
+      </w:r>
+      <w:proofErr w:type="spellEnd"/>
+      <w:r>
+        <w:rPr>
+          <w:rFonts w:ascii="Cambria Math" w:hAnsi="Cambria Math"/>
+        </w:rPr>
+        <w:t xml:space="preserve"> – </w:t>
+      </w:r>
+      <w:proofErr w:type="spellStart"/>
+      <w:r>
+        <w:rPr>
+          <w:rFonts w:ascii="Cambria Math" w:hAnsi="Cambria Math"/>
+        </w:rPr>
+        <w:t>bP</w:t>
+      </w:r>
+      <w:proofErr w:type="spellEnd"/>
+      <w:r>
+        <w:rPr>
+          <w:rFonts w:ascii="Cambria Math" w:hAnsi="Cambria Math"/>
+        </w:rPr>
+        <w:t>² = 0</w:t>
+      </w:r>
+      <w:r>
+        <w:rPr>
+          <w:rFonts w:ascii="Cambria Math" w:hAnsi="Cambria Math"/>
+        </w:rPr>
+        <w:t xml:space="preserve"> </w:t>
+      </w:r>
       <w:r>
         <w:rPr>
           <w:rFonts w:ascii="Cambria Math" w:hAnsi="Cambria Math"/>
@@ -1747,7 +1933,21 @@
         <w:rPr>
           <w:rFonts w:ascii="Cambria Math" w:hAnsi="Cambria Math"/>
         </w:rPr>
-        <w:t xml:space="preserve"> P(a – bP) = 0</w:t>
+        <w:t xml:space="preserve"> P(a – </w:t>
+      </w:r>
+      <w:proofErr w:type="spellStart"/>
+      <w:r>
+        <w:rPr>
+          <w:rFonts w:ascii="Cambria Math" w:hAnsi="Cambria Math"/>
+        </w:rPr>
+        <w:t>bP</w:t>
+      </w:r>
+      <w:proofErr w:type="spellEnd"/>
+      <w:r>
+        <w:rPr>
+          <w:rFonts w:ascii="Cambria Math" w:hAnsi="Cambria Math"/>
+        </w:rPr>
+        <w:t>) = 0</w:t>
       </w:r>
     </w:p>
     <w:p>
@@ -1766,7 +1966,21 @@
         <w:rPr>
           <w:rFonts w:ascii="Cambria Math" w:hAnsi="Cambria Math"/>
         </w:rPr>
-        <w:t>P(a – bP) = 0 si :</w:t>
+        <w:t xml:space="preserve">P(a – </w:t>
+      </w:r>
+      <w:proofErr w:type="spellStart"/>
+      <w:r>
+        <w:rPr>
+          <w:rFonts w:ascii="Cambria Math" w:hAnsi="Cambria Math"/>
+        </w:rPr>
+        <w:t>bP</w:t>
+      </w:r>
+      <w:proofErr w:type="spellEnd"/>
+      <w:r>
+        <w:rPr>
+          <w:rFonts w:ascii="Cambria Math" w:hAnsi="Cambria Math"/>
+        </w:rPr>
+        <w:t>) = 0 si :</w:t>
       </w:r>
     </w:p>
     <w:p>
@@ -1802,7 +2016,21 @@
         <w:rPr>
           <w:rFonts w:ascii="Cambria Math" w:hAnsi="Cambria Math"/>
         </w:rPr>
-        <w:t>a – bP = 0</w:t>
+        <w:t xml:space="preserve">a – </w:t>
+      </w:r>
+      <w:proofErr w:type="spellStart"/>
+      <w:r>
+        <w:rPr>
+          <w:rFonts w:ascii="Cambria Math" w:hAnsi="Cambria Math"/>
+        </w:rPr>
+        <w:t>bP</w:t>
+      </w:r>
+      <w:proofErr w:type="spellEnd"/>
+      <w:r>
+        <w:rPr>
+          <w:rFonts w:ascii="Cambria Math" w:hAnsi="Cambria Math"/>
+        </w:rPr>
+        <w:t xml:space="preserve"> = 0</w:t>
       </w:r>
     </w:p>
     <w:p>
@@ -1819,7 +2047,23 @@
           <w:rFonts w:ascii="Cambria Math" w:hAnsi="Cambria Math"/>
           <w:lang w:val="en-US"/>
         </w:rPr>
-        <w:t xml:space="preserve">a – bP = 0 </w:t>
+        <w:t xml:space="preserve">a – </w:t>
+      </w:r>
+      <w:proofErr w:type="spellStart"/>
+      <w:r>
+        <w:rPr>
+          <w:rFonts w:ascii="Cambria Math" w:hAnsi="Cambria Math"/>
+          <w:lang w:val="en-US"/>
+        </w:rPr>
+        <w:t>bP</w:t>
+      </w:r>
+      <w:proofErr w:type="spellEnd"/>
+      <w:r>
+        <w:rPr>
+          <w:rFonts w:ascii="Cambria Math" w:hAnsi="Cambria Math"/>
+          <w:lang w:val="en-US"/>
+        </w:rPr>
+        <w:t xml:space="preserve"> = 0 </w:t>
       </w:r>
       <w:r>
         <w:rPr>
@@ -1832,7 +2076,23 @@
           <w:rFonts w:ascii="Cambria Math" w:hAnsi="Cambria Math"/>
           <w:lang w:val="en-US"/>
         </w:rPr>
-        <w:t xml:space="preserve"> - bP = -a </w:t>
+        <w:t xml:space="preserve"> - </w:t>
+      </w:r>
+      <w:proofErr w:type="spellStart"/>
+      <w:r>
+        <w:rPr>
+          <w:rFonts w:ascii="Cambria Math" w:hAnsi="Cambria Math"/>
+          <w:lang w:val="en-US"/>
+        </w:rPr>
+        <w:t>bP</w:t>
+      </w:r>
+      <w:proofErr w:type="spellEnd"/>
+      <w:r>
+        <w:rPr>
+          <w:rFonts w:ascii="Cambria Math" w:hAnsi="Cambria Math"/>
+          <w:lang w:val="en-US"/>
+        </w:rPr>
+        <w:t xml:space="preserve"> = -a </w:t>
       </w:r>
       <w:r>
         <w:rPr>
@@ -1845,7 +2105,23 @@
           <w:rFonts w:ascii="Cambria Math" w:hAnsi="Cambria Math"/>
           <w:lang w:val="en-US"/>
         </w:rPr>
-        <w:t xml:space="preserve"> bP = a </w:t>
+        <w:t xml:space="preserve"> </w:t>
+      </w:r>
+      <w:proofErr w:type="spellStart"/>
+      <w:r>
+        <w:rPr>
+          <w:rFonts w:ascii="Cambria Math" w:hAnsi="Cambria Math"/>
+          <w:lang w:val="en-US"/>
+        </w:rPr>
+        <w:t>bP</w:t>
+      </w:r>
+      <w:proofErr w:type="spellEnd"/>
+      <w:r>
+        <w:rPr>
+          <w:rFonts w:ascii="Cambria Math" w:hAnsi="Cambria Math"/>
+          <w:lang w:val="en-US"/>
+        </w:rPr>
+        <w:t xml:space="preserve"> = a </w:t>
       </w:r>
       <w:r>
         <w:rPr>
@@ -2430,15 +2706,7 @@
                 <w:sz w:val="32"/>
                 <w:szCs w:val="32"/>
               </w:rPr>
-              <m:t>ⅆ</m:t>
-            </m:r>
-            <m:r>
-              <w:rPr>
-                <w:rFonts w:ascii="Cambria Math" w:hAnsi="Cambria Math"/>
-                <w:sz w:val="32"/>
-                <w:szCs w:val="32"/>
-              </w:rPr>
-              <m:t>H</m:t>
+              <m:t>ⅆH</m:t>
             </m:r>
           </m:num>
           <m:den>
@@ -2514,15 +2782,7 @@
                 <w:sz w:val="32"/>
                 <w:szCs w:val="32"/>
               </w:rPr>
-              <m:t>ⅆ</m:t>
-            </m:r>
-            <m:r>
-              <w:rPr>
-                <w:rFonts w:ascii="Cambria Math" w:hAnsi="Cambria Math"/>
-                <w:sz w:val="32"/>
-                <w:szCs w:val="32"/>
-              </w:rPr>
-              <m:t>H</m:t>
+              <m:t>ⅆH</m:t>
             </m:r>
           </m:num>
           <m:den>
@@ -2970,15 +3230,7 @@
                 <w:sz w:val="32"/>
                 <w:szCs w:val="32"/>
               </w:rPr>
-              <m:t>ⅆ</m:t>
-            </m:r>
-            <m:r>
-              <w:rPr>
-                <w:rFonts w:ascii="Cambria Math" w:hAnsi="Cambria Math"/>
-                <w:sz w:val="32"/>
-                <w:szCs w:val="32"/>
-              </w:rPr>
-              <m:t>C</m:t>
+              <m:t>ⅆC</m:t>
             </m:r>
           </m:num>
           <m:den>
@@ -3045,15 +3297,7 @@
                 <w:sz w:val="32"/>
                 <w:szCs w:val="32"/>
               </w:rPr>
-              <m:t>ⅆ</m:t>
-            </m:r>
-            <m:r>
-              <w:rPr>
-                <w:rFonts w:ascii="Cambria Math" w:hAnsi="Cambria Math"/>
-                <w:sz w:val="32"/>
-                <w:szCs w:val="32"/>
-              </w:rPr>
-              <m:t>C</m:t>
+              <m:t>ⅆC</m:t>
             </m:r>
           </m:num>
           <m:den>
@@ -3463,6 +3707,77 @@
           <w:rFonts w:ascii="Cambria Math" w:hAnsi="Cambria Math"/>
         </w:rPr>
         <w:t>Si la population de proies devient nulle, alors le système dynamique s’effondre.</w:t>
+      </w:r>
+      <w:r>
+        <w:rPr>
+          <w:rFonts w:ascii="Cambria Math" w:hAnsi="Cambria Math"/>
+        </w:rPr>
+        <w:t xml:space="preserve"> L</w:t>
+      </w:r>
+      <w:r>
+        <w:rPr>
+          <w:rFonts w:ascii="Cambria Math" w:hAnsi="Cambria Math"/>
+        </w:rPr>
+        <w:t>a population de prédateurs va se réduire drastiquement, étant donné que plus aucune nourriture n’est disponible. Elle va tendre vers 0 au fil du temps.</w:t>
+      </w:r>
+    </w:p>
+    <w:p>
+      <w:pPr>
+        <w:rPr>
+          <w:rFonts w:ascii="Cambria Math" w:hAnsi="Cambria Math"/>
+        </w:rPr>
+      </w:pPr>
+    </w:p>
+    <w:p>
+      <w:pPr>
+        <w:rPr>
+          <w:rFonts w:ascii="Cambria Math" w:hAnsi="Cambria Math"/>
+        </w:rPr>
+      </w:pPr>
+      <w:r>
+        <w:rPr>
+          <w:rFonts w:ascii="Cambria Math" w:hAnsi="Cambria Math"/>
+        </w:rPr>
+        <w:t>(3) Si, à un instant donné t0, la population de prédateurs s’effondre subitement – C(t0) = 0, que devient le système dynamique ? comment se comportent les populations après t0 ?</w:t>
+      </w:r>
+    </w:p>
+    <w:p>
+      <w:pPr>
+        <w:rPr>
+          <w:rFonts w:ascii="Cambria Math" w:hAnsi="Cambria Math"/>
+        </w:rPr>
+      </w:pPr>
+    </w:p>
+    <w:p>
+      <w:pPr>
+        <w:rPr>
+          <w:rFonts w:ascii="Times New Roman" w:hAnsi="Times New Roman" w:cs="Times New Roman"/>
+        </w:rPr>
+      </w:pPr>
+      <w:r>
+        <w:rPr>
+          <w:rFonts w:ascii="Cambria Math" w:hAnsi="Cambria Math"/>
+        </w:rPr>
+        <w:lastRenderedPageBreak/>
+        <w:t xml:space="preserve">Si la population de prédateurs s’effondre, alors le système dynamique sera déséquilibré. </w:t>
+      </w:r>
+      <w:r>
+        <w:rPr>
+          <w:rFonts w:ascii="Times New Roman" w:hAnsi="Times New Roman" w:cs="Times New Roman"/>
+        </w:rPr>
+        <w:t xml:space="preserve">Étant donné que les proies disposent de nourriture à l’infini, elles vont pouvoir vivre et se reproduire, jusqu’à atteindre </w:t>
+      </w:r>
+      <w:r>
+        <w:rPr>
+          <w:rFonts w:ascii="Times New Roman" w:hAnsi="Times New Roman" w:cs="Times New Roman"/>
+        </w:rPr>
+        <w:t>théoriquement la</w:t>
+      </w:r>
+      <w:r>
+        <w:rPr>
+          <w:rFonts w:ascii="Times New Roman" w:hAnsi="Times New Roman" w:cs="Times New Roman"/>
+        </w:rPr>
+        <w:t xml:space="preserve"> limite de l’infini.</w:t>
       </w:r>
     </w:p>
     <w:p>
@@ -4206,7 +4521,6 @@
   <w:style w:type="character" w:default="1" w:styleId="Policepardfaut">
     <w:name w:val="Default Paragraph Font"/>
     <w:uiPriority w:val="1"/>
-    <w:semiHidden/>
     <w:unhideWhenUsed/>
   </w:style>
   <w:style w:type="table" w:default="1" w:styleId="TableauNormal">

</xml_diff>

<commit_message>
Finition du fichier Excel de représentation du modèle de Lotka-Volterra et corrections dans les exercices.
</commit_message>
<xml_diff>
--- a/Maths/Moteur_RTS_exercices_maths_partie_1.docx
+++ b/Maths/Moteur_RTS_exercices_maths_partie_1.docx
@@ -618,7 +618,19 @@
         <w:rPr>
           <w:rFonts w:ascii="Cambria Math" w:hAnsi="Cambria Math"/>
         </w:rPr>
-        <w:t>D’après le graphique, la population de lapins va tendre jusqu’à l’infini de façon exponentielle au fur et à mesure du temps.</w:t>
+        <w:t xml:space="preserve">D’après le graphique, la population de lapins va tendre </w:t>
+      </w:r>
+      <w:r>
+        <w:rPr>
+          <w:rFonts w:ascii="Cambria Math" w:hAnsi="Cambria Math"/>
+        </w:rPr>
+        <w:t>vers</w:t>
+      </w:r>
+      <w:r>
+        <w:rPr>
+          <w:rFonts w:ascii="Cambria Math" w:hAnsi="Cambria Math"/>
+        </w:rPr>
+        <w:t xml:space="preserve"> l’infini de façon exponentielle au fur et à mesure du temps.</w:t>
       </w:r>
     </w:p>
     <w:p>
@@ -658,7 +670,13 @@
         <w:rPr>
           <w:rFonts w:ascii="Cambria Math" w:hAnsi="Cambria Math"/>
         </w:rPr>
-        <w:t>Oui, la population n’augmente plus.</w:t>
+        <w:t xml:space="preserve">Oui, </w:t>
+      </w:r>
+      <w:r>
+        <w:rPr>
+          <w:rFonts w:ascii="Cambria Math" w:hAnsi="Cambria Math"/>
+        </w:rPr>
+        <w:t>théoriquement, la population va toujours tendre vers l’infini, mais cela se fait tellement lentement que la population semble ne pas augmenter.</w:t>
       </w:r>
     </w:p>
     <w:p>
@@ -1094,6 +1112,7 @@
         <w:rPr>
           <w:rFonts w:ascii="Cambria Math" w:hAnsi="Cambria Math"/>
         </w:rPr>
+        <w:lastRenderedPageBreak/>
         <w:t>(2) Vers quelle valeur la population s’établit-elle à l’équilibre ?</w:t>
       </w:r>
     </w:p>
@@ -1114,7 +1133,37 @@
         <w:rPr>
           <w:rFonts w:ascii="Cambria Math" w:hAnsi="Cambria Math"/>
         </w:rPr>
-        <w:t>La population s’établie à l’équilibre autour de K.</w:t>
+        <w:t xml:space="preserve">La population s’établie à l’équilibre </w:t>
+      </w:r>
+      <w:r>
+        <w:rPr>
+          <w:rFonts w:ascii="Cambria Math" w:hAnsi="Cambria Math"/>
+        </w:rPr>
+        <w:t>tend</w:t>
+      </w:r>
+      <w:r>
+        <w:rPr>
+          <w:rFonts w:ascii="Cambria Math" w:hAnsi="Cambria Math"/>
+        </w:rPr>
+        <w:t xml:space="preserve"> </w:t>
+      </w:r>
+      <w:r>
+        <w:rPr>
+          <w:rFonts w:ascii="Cambria Math" w:hAnsi="Cambria Math"/>
+        </w:rPr>
+        <w:t>vers</w:t>
+      </w:r>
+      <w:r>
+        <w:rPr>
+          <w:rFonts w:ascii="Cambria Math" w:hAnsi="Cambria Math"/>
+        </w:rPr>
+        <w:t xml:space="preserve"> K</w:t>
+      </w:r>
+      <w:r>
+        <w:rPr>
+          <w:rFonts w:ascii="Cambria Math" w:hAnsi="Cambria Math"/>
+        </w:rPr>
+        <w:t>, soit 5 dans ce cas.</w:t>
       </w:r>
     </w:p>
     <w:p>
@@ -3596,7 +3645,7 @@
               <w:rPr>
                 <w:rFonts w:ascii="Cambria Math" w:hAnsi="Cambria Math"/>
               </w:rPr>
-              <m:t xml:space="preserve"> α</m:t>
+              <m:t xml:space="preserve"> γ</m:t>
             </m:r>
           </m:num>
           <m:den>
@@ -3607,7 +3656,7 @@
               <w:rPr>
                 <w:rFonts w:ascii="Cambria Math" w:hAnsi="Cambria Math"/>
               </w:rPr>
-              <m:t xml:space="preserve"> β</m:t>
+              <m:t xml:space="preserve"> δ</m:t>
             </m:r>
           </m:den>
         </m:f>
@@ -3650,7 +3699,7 @@
               <w:rPr>
                 <w:rFonts w:ascii="Cambria Math" w:hAnsi="Cambria Math"/>
               </w:rPr>
-              <m:t xml:space="preserve"> γ</m:t>
+              <m:t xml:space="preserve"> α</m:t>
             </m:r>
           </m:num>
           <m:den>
@@ -3661,7 +3710,7 @@
               <w:rPr>
                 <w:rFonts w:ascii="Cambria Math" w:hAnsi="Cambria Math"/>
               </w:rPr>
-              <m:t xml:space="preserve"> δ</m:t>
+              <m:t xml:space="preserve"> β</m:t>
             </m:r>
           </m:den>
         </m:f>
@@ -4521,6 +4570,7 @@
   <w:style w:type="character" w:default="1" w:styleId="Policepardfaut">
     <w:name w:val="Default Paragraph Font"/>
     <w:uiPriority w:val="1"/>
+    <w:semiHidden/>
     <w:unhideWhenUsed/>
   </w:style>
   <w:style w:type="table" w:default="1" w:styleId="TableauNormal">

</xml_diff>